<commit_message>
Dashboard Student Handler Spec update
</commit_message>
<xml_diff>
--- a/docs/Jadi Dashboard Student Bio Specs.docx
+++ b/docs/Jadi Dashboard Student Bio Specs.docx
@@ -19,23 +19,7 @@
         </w:numPr>
       </w:pPr>
       <w:r>
-        <w:t>Search by last and first name (like &lt;%</w:t>
-      </w:r>
-      <w:proofErr w:type="spellStart"/>
-      <w:r>
-        <w:t>lastname</w:t>
-      </w:r>
-      <w:proofErr w:type="spellEnd"/>
-      <w:r>
-        <w:t>%&gt; and like &lt;%</w:t>
-      </w:r>
-      <w:proofErr w:type="spellStart"/>
-      <w:r>
-        <w:t>firstname</w:t>
-      </w:r>
-      <w:proofErr w:type="spellEnd"/>
-      <w:r>
-        <w:t>%&gt;)</w:t>
+        <w:t>Search by last and first name (like &lt;%lastname%&gt; and like &lt;%firstname%&gt;)</w:t>
       </w:r>
     </w:p>
     <w:p>
@@ -47,13 +31,8 @@
         </w:numPr>
       </w:pPr>
       <w:r>
-        <w:t xml:space="preserve">Search by </w:t>
-      </w:r>
-      <w:proofErr w:type="spellStart"/>
-      <w:r>
-        <w:t>idnumber</w:t>
-      </w:r>
-      <w:proofErr w:type="spellEnd"/>
+        <w:t>Search by idnumber</w:t>
+      </w:r>
     </w:p>
     <w:p>
       <w:pPr>
@@ -64,71 +43,16 @@
         </w:numPr>
       </w:pPr>
       <w:r>
-        <w:t xml:space="preserve">Return </w:t>
-      </w:r>
-      <w:proofErr w:type="spellStart"/>
-      <w:r>
-        <w:t>recordset</w:t>
-      </w:r>
-      <w:proofErr w:type="spellEnd"/>
-      <w:r>
-        <w:t xml:space="preserve"> containing: </w:t>
-      </w:r>
-      <w:proofErr w:type="spellStart"/>
-      <w:proofErr w:type="gramStart"/>
-      <w:r>
-        <w:t>idnumber,lastname</w:t>
-      </w:r>
-      <w:proofErr w:type="gramEnd"/>
-      <w:r>
-        <w:t>,firstname</w:t>
-      </w:r>
-      <w:proofErr w:type="spellEnd"/>
-      <w:r>
-        <w:t xml:space="preserve">, </w:t>
-      </w:r>
-      <w:r>
-        <w:t xml:space="preserve">email, </w:t>
-      </w:r>
-      <w:proofErr w:type="spellStart"/>
-      <w:proofErr w:type="gramStart"/>
-      <w:r>
-        <w:t>phone,</w:t>
-      </w:r>
-      <w:r>
-        <w:t>lastcleared</w:t>
-      </w:r>
-      <w:proofErr w:type="gramEnd"/>
-      <w:r>
-        <w:t>,accountbalance</w:t>
-      </w:r>
-      <w:proofErr w:type="spellEnd"/>
-      <w:r>
-        <w:t xml:space="preserve">, </w:t>
-      </w:r>
-      <w:proofErr w:type="spellStart"/>
-      <w:proofErr w:type="gramStart"/>
-      <w:r>
-        <w:t>cCode,</w:t>
-      </w:r>
-      <w:r>
-        <w:t>ClearedCurrentSession</w:t>
-      </w:r>
-      <w:proofErr w:type="gramEnd"/>
-      <w:r>
-        <w:t>,</w:t>
-      </w:r>
-      <w:proofErr w:type="gramStart"/>
-      <w:r>
-        <w:t>icon</w:t>
-      </w:r>
-      <w:proofErr w:type="spellEnd"/>
-      <w:r>
-        <w:t>,[</w:t>
-      </w:r>
-      <w:proofErr w:type="gramEnd"/>
-      <w:r>
-        <w:t>ID](hidden)</w:t>
+        <w:t xml:space="preserve">Return recordset containing: idnumber,lastname,firstname, </w:t>
+      </w:r>
+      <w:r>
+        <w:t>email, phone,</w:t>
+      </w:r>
+      <w:r>
+        <w:t>lastcleared,accountbalance, cCode,</w:t>
+      </w:r>
+      <w:r>
+        <w:t>ClearedCurrentSession,icon,[ID](hidden)</w:t>
       </w:r>
     </w:p>
     <w:p>
@@ -151,11 +75,9 @@
           <w:numId w:val="1"/>
         </w:numPr>
       </w:pPr>
-      <w:proofErr w:type="spellStart"/>
       <w:r>
         <w:t>Idnumber</w:t>
       </w:r>
-      <w:proofErr w:type="spellEnd"/>
     </w:p>
     <w:p>
       <w:pPr>
@@ -165,16 +87,12 @@
           <w:numId w:val="1"/>
         </w:numPr>
       </w:pPr>
-      <w:proofErr w:type="spellStart"/>
-      <w:proofErr w:type="gramStart"/>
       <w:r>
         <w:t>l</w:t>
       </w:r>
       <w:r>
         <w:t>astname</w:t>
       </w:r>
-      <w:proofErr w:type="spellEnd"/>
-      <w:proofErr w:type="gramEnd"/>
     </w:p>
     <w:p>
       <w:pPr>
@@ -184,13 +102,9 @@
           <w:numId w:val="1"/>
         </w:numPr>
       </w:pPr>
-      <w:proofErr w:type="spellStart"/>
-      <w:proofErr w:type="gramStart"/>
       <w:r>
         <w:t>Firstname</w:t>
       </w:r>
-      <w:proofErr w:type="spellEnd"/>
-      <w:proofErr w:type="gramEnd"/>
     </w:p>
     <w:p>
       <w:pPr>
@@ -200,11 +114,9 @@
           <w:numId w:val="1"/>
         </w:numPr>
       </w:pPr>
-      <w:proofErr w:type="spellStart"/>
       <w:r>
         <w:t>Midname</w:t>
       </w:r>
-      <w:proofErr w:type="spellEnd"/>
     </w:p>
     <w:p>
       <w:pPr>
@@ -226,13 +138,9 @@
           <w:numId w:val="1"/>
         </w:numPr>
       </w:pPr>
-      <w:proofErr w:type="spellStart"/>
-      <w:proofErr w:type="gramStart"/>
       <w:r>
         <w:t>accountbalance</w:t>
       </w:r>
-      <w:proofErr w:type="spellEnd"/>
-      <w:proofErr w:type="gramEnd"/>
     </w:p>
     <w:p>
       <w:pPr>
@@ -254,11 +162,9 @@
           <w:numId w:val="1"/>
         </w:numPr>
       </w:pPr>
-      <w:proofErr w:type="spellStart"/>
       <w:r>
         <w:t>lastcleared</w:t>
       </w:r>
-      <w:proofErr w:type="spellEnd"/>
     </w:p>
     <w:p>
       <w:pPr>
@@ -328,14 +234,12 @@
           <w:numId w:val="1"/>
         </w:numPr>
       </w:pPr>
-      <w:proofErr w:type="spellStart"/>
       <w:r>
         <w:t>state</w:t>
       </w:r>
       <w:r>
         <w:t>code</w:t>
       </w:r>
-      <w:proofErr w:type="spellEnd"/>
     </w:p>
     <w:p>
       <w:pPr>
@@ -345,14 +249,12 @@
           <w:numId w:val="1"/>
         </w:numPr>
       </w:pPr>
-      <w:proofErr w:type="spellStart"/>
       <w:r>
         <w:t>zip</w:t>
       </w:r>
       <w:r>
         <w:t>code</w:t>
       </w:r>
-      <w:proofErr w:type="spellEnd"/>
     </w:p>
     <w:p>
       <w:pPr>
@@ -374,11 +276,9 @@
           <w:numId w:val="1"/>
         </w:numPr>
       </w:pPr>
-      <w:proofErr w:type="spellStart"/>
       <w:r>
         <w:t>clearedcurrentsession</w:t>
       </w:r>
-      <w:proofErr w:type="spellEnd"/>
     </w:p>
     <w:p>
       <w:pPr>
@@ -388,37 +288,11 @@
           <w:numId w:val="1"/>
         </w:numPr>
       </w:pPr>
-      <w:proofErr w:type="spellStart"/>
-      <w:proofErr w:type="gramStart"/>
-      <w:r>
-        <w:t>clearedon</w:t>
-      </w:r>
-      <w:proofErr w:type="spellEnd"/>
-      <w:r>
-        <w:t xml:space="preserve"> </w:t>
-      </w:r>
-      <w:r>
-        <w:t xml:space="preserve"> (</w:t>
-      </w:r>
-      <w:proofErr w:type="gramEnd"/>
-      <w:r>
-        <w:t xml:space="preserve">substring(clearedon,5,2) </w:t>
-      </w:r>
-      <w:proofErr w:type="gramStart"/>
-      <w:r>
-        <w:t>+ ‘/</w:t>
-      </w:r>
-      <w:proofErr w:type="gramEnd"/>
-      <w:r>
-        <w:t>’+substring(clearedon,7,</w:t>
-      </w:r>
-      <w:proofErr w:type="gramStart"/>
-      <w:r>
-        <w:t>2)+</w:t>
-      </w:r>
-      <w:proofErr w:type="gramEnd"/>
-      <w:r>
-        <w:t>’/’+substring(clearedon,1,4)</w:t>
+      <w:r>
+        <w:t xml:space="preserve">clearedon </w:t>
+      </w:r>
+      <w:r>
+        <w:t xml:space="preserve"> (substring(clearedon,5,2) + ‘/’+substring(clearedon,7,2)+’/’+substring(clearedon,1,4)</w:t>
       </w:r>
     </w:p>
     <w:p>
@@ -448,21 +322,8 @@
         <w:t>Address d</w:t>
       </w:r>
       <w:r>
-        <w:t xml:space="preserve">erived </w:t>
-      </w:r>
-      <w:proofErr w:type="gramStart"/>
-      <w:r>
-        <w:t>from .</w:t>
-      </w:r>
-      <w:proofErr w:type="spellStart"/>
-      <w:r>
-        <w:t>env</w:t>
-      </w:r>
-      <w:proofErr w:type="gramEnd"/>
-      <w:r>
-        <w:t>.local</w:t>
-      </w:r>
-      <w:proofErr w:type="spellEnd"/>
+        <w:t>erived from .env.local</w:t>
+      </w:r>
     </w:p>
     <w:p>
       <w:pPr>
@@ -473,15 +334,7 @@
         </w:numPr>
       </w:pPr>
       <w:r>
-        <w:t>STUDENT_PHOTO_SHARE + &lt;</w:t>
-      </w:r>
-      <w:proofErr w:type="spellStart"/>
-      <w:r>
-        <w:t>idnumber</w:t>
-      </w:r>
-      <w:proofErr w:type="spellEnd"/>
-      <w:r>
-        <w:t>&gt;.jpg</w:t>
+        <w:t>STUDENT_PHOTO_SHARE + &lt;idnumber&gt;.jpg</w:t>
       </w:r>
     </w:p>
     <w:p>
@@ -508,41 +361,7 @@
         <w:ind w:left="2880"/>
       </w:pPr>
       <w:r>
-        <w:t xml:space="preserve">If the </w:t>
-      </w:r>
-      <w:proofErr w:type="spellStart"/>
-      <w:proofErr w:type="gramStart"/>
-      <w:r>
-        <w:t>tblstudent.Lastcleared</w:t>
-      </w:r>
-      <w:proofErr w:type="spellEnd"/>
-      <w:proofErr w:type="gramEnd"/>
-      <w:r>
-        <w:t xml:space="preserve"> in (</w:t>
-      </w:r>
-      <w:proofErr w:type="spellStart"/>
-      <w:r>
-        <w:t>tblOUSA.JADI_</w:t>
-      </w:r>
-      <w:proofErr w:type="gramStart"/>
-      <w:r>
-        <w:t>Tradname,tblOUSA.JADI</w:t>
-      </w:r>
-      <w:proofErr w:type="gramEnd"/>
-      <w:r>
-        <w:t>_LeapName</w:t>
-      </w:r>
-      <w:proofErr w:type="spellEnd"/>
-      <w:r>
-        <w:t xml:space="preserve">) and </w:t>
-      </w:r>
-      <w:proofErr w:type="spellStart"/>
-      <w:r>
-        <w:t>tblOUSA.isCurrent</w:t>
-      </w:r>
-      <w:proofErr w:type="spellEnd"/>
-      <w:r>
-        <w:t xml:space="preserve"> = 1 then display: Current Semester Transactions Card</w:t>
+        <w:t>If the tblstudent.Lastcleared in (tblOUSA.JADI_Tradname,tblOUSA.JADI_LeapName) and tblOUSA.isCurrent = 1 then display: Current Semester Transactions Card</w:t>
       </w:r>
     </w:p>
     <w:p>
@@ -563,55 +382,10 @@
         <w:t xml:space="preserve">select </w:t>
       </w:r>
       <w:r>
-        <w:t>TRANS_</w:t>
-      </w:r>
-      <w:proofErr w:type="gramStart"/>
-      <w:r>
-        <w:t>DTE,TRANS</w:t>
-      </w:r>
-      <w:proofErr w:type="gramEnd"/>
-      <w:r>
-        <w:t>_</w:t>
-      </w:r>
-      <w:proofErr w:type="gramStart"/>
-      <w:r>
-        <w:t>DESC,TRANS</w:t>
-      </w:r>
-      <w:proofErr w:type="gramEnd"/>
-      <w:r>
-        <w:t>_AMT</w:t>
-      </w:r>
-      <w:r>
-        <w:t xml:space="preserve"> from </w:t>
-      </w:r>
-      <w:proofErr w:type="spellStart"/>
-      <w:proofErr w:type="gramStart"/>
-      <w:r>
-        <w:t>jadi.dbo.trans</w:t>
-      </w:r>
-      <w:proofErr w:type="gramEnd"/>
-      <w:r>
-        <w:t>_hist</w:t>
-      </w:r>
-      <w:proofErr w:type="spellEnd"/>
-      <w:r>
-        <w:t xml:space="preserve"> where </w:t>
-      </w:r>
-      <w:proofErr w:type="spellStart"/>
-      <w:r>
-        <w:t>id_num</w:t>
-      </w:r>
-      <w:proofErr w:type="spellEnd"/>
-      <w:r>
-        <w:t xml:space="preserve"> = 176941 order by </w:t>
-      </w:r>
-      <w:proofErr w:type="spellStart"/>
-      <w:r>
-        <w:t>trans_dte</w:t>
-      </w:r>
-      <w:proofErr w:type="spellEnd"/>
-      <w:r>
-        <w:t xml:space="preserve"> desc </w:t>
+        <w:t>TRANS_DTE,TRANS_DESC,TRANS_AMT</w:t>
+      </w:r>
+      <w:r>
+        <w:t xml:space="preserve"> from jadi.dbo.trans_hist where id_num = 176941 order by trans_dte desc </w:t>
       </w:r>
     </w:p>
     <w:p>
@@ -696,31 +470,7 @@
           <w:szCs w:val="18"/>
           <w14:ligatures w14:val="none"/>
         </w:rPr>
-        <w:t>[</w:t>
-      </w:r>
-      <w:proofErr w:type="spellStart"/>
-      <w:r>
-        <w:rPr>
-          <w:rFonts w:ascii="Cascadia Mono" w:eastAsia="Times New Roman" w:hAnsi="Cascadia Mono" w:cs="Cascadia Mono"/>
-          <w:color w:val="000000"/>
-          <w:kern w:val="0"/>
-          <w:sz w:val="18"/>
-          <w:szCs w:val="18"/>
-          <w14:ligatures w14:val="none"/>
-        </w:rPr>
-        <w:t>DatePosted</w:t>
-      </w:r>
-      <w:proofErr w:type="spellEnd"/>
-      <w:r>
-        <w:rPr>
-          <w:rFonts w:ascii="Cascadia Mono" w:eastAsia="Times New Roman" w:hAnsi="Cascadia Mono" w:cs="Cascadia Mono"/>
-          <w:color w:val="000000"/>
-          <w:kern w:val="0"/>
-          <w:sz w:val="18"/>
-          <w:szCs w:val="18"/>
-          <w14:ligatures w14:val="none"/>
-        </w:rPr>
-        <w:t>]</w:t>
+        <w:t>[DatePosted]</w:t>
       </w:r>
       <w:r>
         <w:rPr>
@@ -755,7 +505,6 @@
         </w:rPr>
         <w:t xml:space="preserve"> </w:t>
       </w:r>
-      <w:proofErr w:type="gramStart"/>
       <w:r>
         <w:rPr>
           <w:rFonts w:ascii="Cascadia Mono" w:eastAsia="Times New Roman" w:hAnsi="Cascadia Mono" w:cs="Cascadia Mono"/>
@@ -800,7 +549,6 @@
         </w:rPr>
         <w:t>(</w:t>
       </w:r>
-      <w:proofErr w:type="gramEnd"/>
       <w:r>
         <w:rPr>
           <w:rFonts w:ascii="Cascadia Mono" w:eastAsia="Times New Roman" w:hAnsi="Cascadia Mono" w:cs="Cascadia Mono"/>
@@ -856,7 +604,6 @@
         </w:rPr>
         <w:t xml:space="preserve"> 101</w:t>
       </w:r>
-      <w:proofErr w:type="gramStart"/>
       <w:r>
         <w:rPr>
           <w:rFonts w:ascii="Cascadia Mono" w:eastAsia="Times New Roman" w:hAnsi="Cascadia Mono" w:cs="Cascadia Mono"/>
@@ -877,19 +624,7 @@
           <w:szCs w:val="18"/>
           <w14:ligatures w14:val="none"/>
         </w:rPr>
-        <w:t>TRANS</w:t>
-      </w:r>
-      <w:proofErr w:type="gramEnd"/>
-      <w:r>
-        <w:rPr>
-          <w:rFonts w:ascii="Cascadia Mono" w:eastAsia="Times New Roman" w:hAnsi="Cascadia Mono" w:cs="Cascadia Mono"/>
-          <w:color w:val="000000"/>
-          <w:kern w:val="0"/>
-          <w:sz w:val="18"/>
-          <w:szCs w:val="18"/>
-          <w14:ligatures w14:val="none"/>
-        </w:rPr>
-        <w:t>_DESC</w:t>
+        <w:t>TRANS_DESC</w:t>
       </w:r>
       <w:r>
         <w:rPr>
@@ -966,7 +701,6 @@
         </w:rPr>
         <w:t>[</w:t>
       </w:r>
-      <w:proofErr w:type="spellStart"/>
       <w:r>
         <w:rPr>
           <w:rFonts w:ascii="Cascadia Mono" w:eastAsia="Times New Roman" w:hAnsi="Cascadia Mono" w:cs="Cascadia Mono"/>
@@ -1000,7 +734,6 @@
         </w:rPr>
         <w:t>Type</w:t>
       </w:r>
-      <w:proofErr w:type="spellEnd"/>
       <w:r>
         <w:rPr>
           <w:rFonts w:ascii="Cascadia Mono" w:eastAsia="Times New Roman" w:hAnsi="Cascadia Mono" w:cs="Cascadia Mono"/>
@@ -1065,31 +798,7 @@
           <w:szCs w:val="18"/>
           <w14:ligatures w14:val="none"/>
         </w:rPr>
-        <w:t xml:space="preserve"> </w:t>
-      </w:r>
-      <w:proofErr w:type="spellStart"/>
-      <w:r>
-        <w:rPr>
-          <w:rFonts w:ascii="Cascadia Mono" w:eastAsia="Times New Roman" w:hAnsi="Cascadia Mono" w:cs="Cascadia Mono"/>
-          <w:color w:val="000000"/>
-          <w:kern w:val="0"/>
-          <w:sz w:val="18"/>
-          <w:szCs w:val="18"/>
-          <w14:ligatures w14:val="none"/>
-        </w:rPr>
-        <w:t>source_cde</w:t>
-      </w:r>
-      <w:proofErr w:type="spellEnd"/>
-      <w:r>
-        <w:rPr>
-          <w:rFonts w:ascii="Cascadia Mono" w:eastAsia="Times New Roman" w:hAnsi="Cascadia Mono" w:cs="Cascadia Mono"/>
-          <w:color w:val="000000"/>
-          <w:kern w:val="0"/>
-          <w:sz w:val="18"/>
-          <w:szCs w:val="18"/>
-          <w14:ligatures w14:val="none"/>
-        </w:rPr>
-        <w:t xml:space="preserve"> </w:t>
+        <w:t xml:space="preserve"> source_cde </w:t>
       </w:r>
     </w:p>
     <w:p>
@@ -1748,18 +1457,7 @@
           <w:szCs w:val="18"/>
           <w14:ligatures w14:val="none"/>
         </w:rPr>
-        <w:t>'IV</w:t>
-      </w:r>
-      <w:r>
-        <w:rPr>
-          <w:rFonts w:ascii="Cascadia Mono" w:eastAsia="Times New Roman" w:hAnsi="Cascadia Mono" w:cs="Cascadia Mono"/>
-          <w:color w:val="FF0000"/>
-          <w:kern w:val="0"/>
-          <w:sz w:val="18"/>
-          <w:szCs w:val="18"/>
-          <w14:ligatures w14:val="none"/>
-        </w:rPr>
-        <w:t>’ then</w:t>
+        <w:t>'IV’ then</w:t>
       </w:r>
       <w:r>
         <w:rPr>
@@ -1986,19 +1684,7 @@
           <w:szCs w:val="18"/>
           <w14:ligatures w14:val="none"/>
         </w:rPr>
-        <w:t xml:space="preserve"> [172.18.96.11,1433\MSSQL</w:t>
-      </w:r>
-      <w:proofErr w:type="gramStart"/>
-      <w:r>
-        <w:rPr>
-          <w:rFonts w:ascii="Cascadia Mono" w:eastAsia="Times New Roman" w:hAnsi="Cascadia Mono" w:cs="Cascadia Mono"/>
-          <w:color w:val="000000"/>
-          <w:kern w:val="0"/>
-          <w:sz w:val="18"/>
-          <w:szCs w:val="18"/>
-          <w14:ligatures w14:val="none"/>
-        </w:rPr>
-        <w:t>]</w:t>
+        <w:t xml:space="preserve"> [172.18.96.11,1433\MSSQL]</w:t>
       </w:r>
       <w:r>
         <w:rPr>
@@ -2020,31 +1706,7 @@
           <w:szCs w:val="18"/>
           <w14:ligatures w14:val="none"/>
         </w:rPr>
-        <w:t>[</w:t>
-      </w:r>
-      <w:proofErr w:type="gramEnd"/>
-      <w:r>
-        <w:rPr>
-          <w:rFonts w:ascii="Cascadia Mono" w:eastAsia="Times New Roman" w:hAnsi="Cascadia Mono" w:cs="Cascadia Mono"/>
-          <w:color w:val="000000"/>
-          <w:kern w:val="0"/>
-          <w:sz w:val="18"/>
-          <w:szCs w:val="18"/>
-          <w14:ligatures w14:val="none"/>
-        </w:rPr>
-        <w:t>TMSEPRD</w:t>
-      </w:r>
-      <w:proofErr w:type="gramStart"/>
-      <w:r>
-        <w:rPr>
-          <w:rFonts w:ascii="Cascadia Mono" w:eastAsia="Times New Roman" w:hAnsi="Cascadia Mono" w:cs="Cascadia Mono"/>
-          <w:color w:val="000000"/>
-          <w:kern w:val="0"/>
-          <w:sz w:val="18"/>
-          <w:szCs w:val="18"/>
-          <w14:ligatures w14:val="none"/>
-        </w:rPr>
-        <w:t>]</w:t>
+        <w:t>[TMSEPRD]</w:t>
       </w:r>
       <w:r>
         <w:rPr>
@@ -2057,7 +1719,6 @@
         </w:rPr>
         <w:t>.</w:t>
       </w:r>
-      <w:proofErr w:type="spellStart"/>
       <w:r>
         <w:rPr>
           <w:rFonts w:ascii="Cascadia Mono" w:eastAsia="Times New Roman" w:hAnsi="Cascadia Mono" w:cs="Cascadia Mono"/>
@@ -2069,7 +1730,6 @@
         </w:rPr>
         <w:t>dbo</w:t>
       </w:r>
-      <w:proofErr w:type="gramEnd"/>
       <w:r>
         <w:rPr>
           <w:rFonts w:ascii="Cascadia Mono" w:eastAsia="Times New Roman" w:hAnsi="Cascadia Mono" w:cs="Cascadia Mono"/>
@@ -2090,9 +1750,41 @@
           <w:szCs w:val="18"/>
           <w14:ligatures w14:val="none"/>
         </w:rPr>
-        <w:t>trans_hist</w:t>
-      </w:r>
-      <w:proofErr w:type="spellEnd"/>
+        <w:t xml:space="preserve">trans_hist </w:t>
+      </w:r>
+      <w:r>
+        <w:rPr>
+          <w:rFonts w:ascii="Cascadia Mono" w:eastAsia="Times New Roman" w:hAnsi="Cascadia Mono" w:cs="Cascadia Mono"/>
+          <w:color w:val="0000FF"/>
+          <w:kern w:val="0"/>
+          <w:sz w:val="18"/>
+          <w:szCs w:val="18"/>
+          <w14:ligatures w14:val="none"/>
+        </w:rPr>
+        <w:t>where</w:t>
+      </w:r>
+      <w:r>
+        <w:rPr>
+          <w:rFonts w:ascii="Cascadia Mono" w:eastAsia="Times New Roman" w:hAnsi="Cascadia Mono" w:cs="Cascadia Mono"/>
+          <w:color w:val="000000"/>
+          <w:kern w:val="0"/>
+          <w:sz w:val="18"/>
+          <w:szCs w:val="18"/>
+          <w14:ligatures w14:val="none"/>
+        </w:rPr>
+        <w:t xml:space="preserve"> ID_NUM </w:t>
+      </w:r>
+      <w:r>
+        <w:rPr>
+          <w:rFonts w:ascii="Cascadia Mono" w:eastAsia="Times New Roman" w:hAnsi="Cascadia Mono" w:cs="Cascadia Mono"/>
+          <w:color w:val="808080"/>
+          <w:kern w:val="0"/>
+          <w:sz w:val="18"/>
+          <w:szCs w:val="18"/>
+          <w14:ligatures w14:val="none"/>
+        </w:rPr>
+        <w:t>=</w:t>
+      </w:r>
       <w:r>
         <w:rPr>
           <w:rFonts w:ascii="Cascadia Mono" w:eastAsia="Times New Roman" w:hAnsi="Cascadia Mono" w:cs="Cascadia Mono"/>
@@ -2107,161 +1799,69 @@
       <w:r>
         <w:rPr>
           <w:rFonts w:ascii="Cascadia Mono" w:eastAsia="Times New Roman" w:hAnsi="Cascadia Mono" w:cs="Cascadia Mono"/>
+          <w:color w:val="000000"/>
+          <w:kern w:val="0"/>
+          <w:sz w:val="18"/>
+          <w:szCs w:val="18"/>
+          <w14:ligatures w14:val="none"/>
+        </w:rPr>
+        <w:t>&lt;idnumber&gt;</w:t>
+      </w:r>
+      <w:r>
+        <w:rPr>
+          <w:rFonts w:ascii="Cascadia Mono" w:eastAsia="Times New Roman" w:hAnsi="Cascadia Mono" w:cs="Cascadia Mono"/>
+          <w:color w:val="000000"/>
+          <w:kern w:val="0"/>
+          <w:sz w:val="18"/>
+          <w:szCs w:val="18"/>
+          <w14:ligatures w14:val="none"/>
+        </w:rPr>
+        <w:t xml:space="preserve"> and SUBSID_CDE </w:t>
+      </w:r>
+      <w:r>
+        <w:rPr>
+          <w:rFonts w:ascii="Cascadia Mono" w:eastAsia="Times New Roman" w:hAnsi="Cascadia Mono" w:cs="Cascadia Mono"/>
+          <w:color w:val="808080"/>
+          <w:kern w:val="0"/>
+          <w:sz w:val="18"/>
+          <w:szCs w:val="18"/>
+          <w14:ligatures w14:val="none"/>
+        </w:rPr>
+        <w:t>=</w:t>
+      </w:r>
+      <w:r>
+        <w:rPr>
+          <w:rFonts w:ascii="Cascadia Mono" w:eastAsia="Times New Roman" w:hAnsi="Cascadia Mono" w:cs="Cascadia Mono"/>
+          <w:color w:val="000000"/>
+          <w:kern w:val="0"/>
+          <w:sz w:val="18"/>
+          <w:szCs w:val="18"/>
+          <w14:ligatures w14:val="none"/>
+        </w:rPr>
+        <w:t xml:space="preserve"> </w:t>
+      </w:r>
+      <w:r>
+        <w:rPr>
+          <w:rFonts w:ascii="Cascadia Mono" w:eastAsia="Times New Roman" w:hAnsi="Cascadia Mono" w:cs="Cascadia Mono"/>
+          <w:color w:val="FF0000"/>
+          <w:kern w:val="0"/>
+          <w:sz w:val="18"/>
+          <w:szCs w:val="18"/>
+          <w14:ligatures w14:val="none"/>
+        </w:rPr>
+        <w:t>'AR'</w:t>
+      </w:r>
+      <w:r>
+        <w:rPr>
+          <w:rFonts w:ascii="Cascadia Mono" w:eastAsia="Times New Roman" w:hAnsi="Cascadia Mono" w:cs="Cascadia Mono"/>
           <w:color w:val="0000FF"/>
           <w:kern w:val="0"/>
           <w:sz w:val="18"/>
           <w:szCs w:val="18"/>
           <w14:ligatures w14:val="none"/>
         </w:rPr>
-        <w:t>where</w:t>
-      </w:r>
-      <w:r>
-        <w:rPr>
-          <w:rFonts w:ascii="Cascadia Mono" w:eastAsia="Times New Roman" w:hAnsi="Cascadia Mono" w:cs="Cascadia Mono"/>
-          <w:color w:val="000000"/>
-          <w:kern w:val="0"/>
-          <w:sz w:val="18"/>
-          <w:szCs w:val="18"/>
-          <w14:ligatures w14:val="none"/>
-        </w:rPr>
-        <w:t xml:space="preserve"> ID_NUM </w:t>
-      </w:r>
-      <w:r>
-        <w:rPr>
-          <w:rFonts w:ascii="Cascadia Mono" w:eastAsia="Times New Roman" w:hAnsi="Cascadia Mono" w:cs="Cascadia Mono"/>
-          <w:color w:val="808080"/>
-          <w:kern w:val="0"/>
-          <w:sz w:val="18"/>
-          <w:szCs w:val="18"/>
-          <w14:ligatures w14:val="none"/>
-        </w:rPr>
-        <w:t>=</w:t>
-      </w:r>
-      <w:r>
-        <w:rPr>
-          <w:rFonts w:ascii="Cascadia Mono" w:eastAsia="Times New Roman" w:hAnsi="Cascadia Mono" w:cs="Cascadia Mono"/>
-          <w:color w:val="000000"/>
-          <w:kern w:val="0"/>
-          <w:sz w:val="18"/>
-          <w:szCs w:val="18"/>
-          <w14:ligatures w14:val="none"/>
-        </w:rPr>
-        <w:t xml:space="preserve"> </w:t>
-      </w:r>
-      <w:r>
-        <w:rPr>
-          <w:rFonts w:ascii="Cascadia Mono" w:eastAsia="Times New Roman" w:hAnsi="Cascadia Mono" w:cs="Cascadia Mono"/>
-          <w:color w:val="000000"/>
-          <w:kern w:val="0"/>
-          <w:sz w:val="18"/>
-          <w:szCs w:val="18"/>
-          <w14:ligatures w14:val="none"/>
-        </w:rPr>
-        <w:t>&lt;</w:t>
-      </w:r>
-      <w:proofErr w:type="spellStart"/>
-      <w:r>
-        <w:rPr>
-          <w:rFonts w:ascii="Cascadia Mono" w:eastAsia="Times New Roman" w:hAnsi="Cascadia Mono" w:cs="Cascadia Mono"/>
-          <w:color w:val="000000"/>
-          <w:kern w:val="0"/>
-          <w:sz w:val="18"/>
-          <w:szCs w:val="18"/>
-          <w14:ligatures w14:val="none"/>
-        </w:rPr>
-        <w:t>idnumber</w:t>
-      </w:r>
-      <w:proofErr w:type="spellEnd"/>
-      <w:r>
-        <w:rPr>
-          <w:rFonts w:ascii="Cascadia Mono" w:eastAsia="Times New Roman" w:hAnsi="Cascadia Mono" w:cs="Cascadia Mono"/>
-          <w:color w:val="000000"/>
-          <w:kern w:val="0"/>
-          <w:sz w:val="18"/>
-          <w:szCs w:val="18"/>
-          <w14:ligatures w14:val="none"/>
-        </w:rPr>
-        <w:t>&gt;</w:t>
-      </w:r>
-      <w:r>
-        <w:rPr>
-          <w:rFonts w:ascii="Cascadia Mono" w:eastAsia="Times New Roman" w:hAnsi="Cascadia Mono" w:cs="Cascadia Mono"/>
-          <w:color w:val="000000"/>
-          <w:kern w:val="0"/>
-          <w:sz w:val="18"/>
-          <w:szCs w:val="18"/>
-          <w14:ligatures w14:val="none"/>
-        </w:rPr>
-        <w:t xml:space="preserve"> and</w:t>
-      </w:r>
-      <w:r>
-        <w:rPr>
-          <w:rFonts w:ascii="Cascadia Mono" w:eastAsia="Times New Roman" w:hAnsi="Cascadia Mono" w:cs="Cascadia Mono"/>
-          <w:color w:val="000000"/>
-          <w:kern w:val="0"/>
-          <w:sz w:val="18"/>
-          <w:szCs w:val="18"/>
-          <w14:ligatures w14:val="none"/>
-        </w:rPr>
-        <w:t xml:space="preserve"> SUBSID_CDE </w:t>
-      </w:r>
-      <w:r>
-        <w:rPr>
-          <w:rFonts w:ascii="Cascadia Mono" w:eastAsia="Times New Roman" w:hAnsi="Cascadia Mono" w:cs="Cascadia Mono"/>
-          <w:color w:val="808080"/>
-          <w:kern w:val="0"/>
-          <w:sz w:val="18"/>
-          <w:szCs w:val="18"/>
-          <w14:ligatures w14:val="none"/>
-        </w:rPr>
-        <w:t>=</w:t>
-      </w:r>
-      <w:r>
-        <w:rPr>
-          <w:rFonts w:ascii="Cascadia Mono" w:eastAsia="Times New Roman" w:hAnsi="Cascadia Mono" w:cs="Cascadia Mono"/>
-          <w:color w:val="000000"/>
-          <w:kern w:val="0"/>
-          <w:sz w:val="18"/>
-          <w:szCs w:val="18"/>
-          <w14:ligatures w14:val="none"/>
-        </w:rPr>
-        <w:t xml:space="preserve"> </w:t>
-      </w:r>
-      <w:r>
-        <w:rPr>
-          <w:rFonts w:ascii="Cascadia Mono" w:eastAsia="Times New Roman" w:hAnsi="Cascadia Mono" w:cs="Cascadia Mono"/>
-          <w:color w:val="FF0000"/>
-          <w:kern w:val="0"/>
-          <w:sz w:val="18"/>
-          <w:szCs w:val="18"/>
-          <w14:ligatures w14:val="none"/>
-        </w:rPr>
-        <w:t>'</w:t>
-      </w:r>
-      <w:proofErr w:type="spellStart"/>
-      <w:r>
-        <w:rPr>
-          <w:rFonts w:ascii="Cascadia Mono" w:eastAsia="Times New Roman" w:hAnsi="Cascadia Mono" w:cs="Cascadia Mono"/>
-          <w:color w:val="FF0000"/>
-          <w:kern w:val="0"/>
-          <w:sz w:val="18"/>
-          <w:szCs w:val="18"/>
-          <w14:ligatures w14:val="none"/>
-        </w:rPr>
-        <w:t>AR'</w:t>
-      </w:r>
-      <w:r>
-        <w:rPr>
-          <w:rFonts w:ascii="Cascadia Mono" w:eastAsia="Times New Roman" w:hAnsi="Cascadia Mono" w:cs="Cascadia Mono"/>
-          <w:color w:val="0000FF"/>
-          <w:kern w:val="0"/>
-          <w:sz w:val="18"/>
-          <w:szCs w:val="18"/>
-          <w14:ligatures w14:val="none"/>
-        </w:rPr>
         <w:t>order</w:t>
       </w:r>
-      <w:proofErr w:type="spellEnd"/>
       <w:r>
         <w:rPr>
           <w:rFonts w:ascii="Cascadia Mono" w:eastAsia="Times New Roman" w:hAnsi="Cascadia Mono" w:cs="Cascadia Mono"/>
@@ -2377,25 +1977,7 @@
         <w:ind w:left="2880"/>
       </w:pPr>
       <w:r>
-        <w:t xml:space="preserve">If </w:t>
-      </w:r>
-      <w:proofErr w:type="spellStart"/>
-      <w:proofErr w:type="gramStart"/>
-      <w:r>
-        <w:t>tblstudent.accountbalance</w:t>
-      </w:r>
-      <w:proofErr w:type="spellEnd"/>
-      <w:proofErr w:type="gramEnd"/>
-      <w:r>
-        <w:t xml:space="preserve"> &gt; 0 then analyze the global history </w:t>
-      </w:r>
-      <w:proofErr w:type="spellStart"/>
-      <w:r>
-        <w:t>recordset</w:t>
-      </w:r>
-      <w:proofErr w:type="spellEnd"/>
-      <w:r>
-        <w:t xml:space="preserve"> as follows:</w:t>
+        <w:t>If tblstudent.accountbalance &gt; 0 then analyze the global history recordset as follows:</w:t>
       </w:r>
     </w:p>
     <w:p>
@@ -2419,15 +2001,7 @@
         </w:numPr>
       </w:pPr>
       <w:r>
-        <w:t xml:space="preserve">Perform ratio of credit transactions (transactions where TRANS_AMT &lt; 0) where </w:t>
-      </w:r>
-      <w:proofErr w:type="spellStart"/>
-      <w:r>
-        <w:t>source_cde</w:t>
-      </w:r>
-      <w:proofErr w:type="spellEnd"/>
-      <w:r>
-        <w:t xml:space="preserve"> = ‘RC’</w:t>
+        <w:t>Perform ratio of credit transactions (transactions where TRANS_AMT &lt; 0) where source_cde = ‘RC’</w:t>
       </w:r>
     </w:p>
     <w:p>
@@ -2439,15 +2013,7 @@
         </w:numPr>
       </w:pPr>
       <w:r>
-        <w:t xml:space="preserve">Perform percentage of credit transactions where </w:t>
-      </w:r>
-      <w:proofErr w:type="spellStart"/>
-      <w:r>
-        <w:t>source_cde</w:t>
-      </w:r>
-      <w:proofErr w:type="spellEnd"/>
-      <w:r>
-        <w:t xml:space="preserve"> = ‘FA’</w:t>
+        <w:t>Perform percentage of credit transactions where source_cde = ‘FA’</w:t>
       </w:r>
     </w:p>
     <w:p>
@@ -2513,29 +2079,8 @@
         </w:numPr>
       </w:pPr>
       <w:r>
-        <w:t xml:space="preserve">Get student </w:t>
-      </w:r>
-      <w:proofErr w:type="spellStart"/>
-      <w:r>
-        <w:t>lastname</w:t>
-      </w:r>
-      <w:proofErr w:type="spellEnd"/>
-      <w:r>
-        <w:t xml:space="preserve"> | </w:t>
-      </w:r>
-      <w:proofErr w:type="spellStart"/>
-      <w:r>
-        <w:t>firstname</w:t>
-      </w:r>
-      <w:proofErr w:type="spellEnd"/>
-      <w:r>
-        <w:t xml:space="preserve">| </w:t>
-      </w:r>
-      <w:proofErr w:type="spellStart"/>
-      <w:r>
-        <w:t>idbadge</w:t>
-      </w:r>
-      <w:proofErr w:type="spellEnd"/>
+        <w:t>Get student lastname | firstname| idbadge</w:t>
+      </w:r>
     </w:p>
     <w:p>
       <w:pPr>
@@ -2549,23 +2094,7 @@
         <w:t>Use n</w:t>
       </w:r>
       <w:r>
-        <w:t xml:space="preserve">ame search logic on </w:t>
-      </w:r>
-      <w:proofErr w:type="spellStart"/>
-      <w:r>
-        <w:t>tblStudent</w:t>
-      </w:r>
-      <w:proofErr w:type="spellEnd"/>
-      <w:r>
-        <w:t xml:space="preserve"> select record on </w:t>
-      </w:r>
-      <w:proofErr w:type="spellStart"/>
-      <w:r>
-        <w:t>recordset</w:t>
-      </w:r>
-      <w:proofErr w:type="spellEnd"/>
-      <w:r>
-        <w:t xml:space="preserve"> selection </w:t>
+        <w:t xml:space="preserve">ame search logic on tblStudent select record on recordset selection </w:t>
       </w:r>
     </w:p>
     <w:p>
@@ -2576,13 +2105,8 @@
           <w:numId w:val="3"/>
         </w:numPr>
       </w:pPr>
-      <w:proofErr w:type="spellStart"/>
-      <w:r>
-        <w:t>Idbadge</w:t>
-      </w:r>
-      <w:proofErr w:type="spellEnd"/>
-      <w:r>
-        <w:t xml:space="preserve"> search logic </w:t>
+      <w:r>
+        <w:t xml:space="preserve">Idbadge search logic </w:t>
       </w:r>
     </w:p>
     <w:p>
@@ -2600,26 +2124,22 @@
         <w:t>if</w:t>
       </w:r>
       <w:r>
-        <w:t xml:space="preserve"> &lt;</w:t>
-      </w:r>
-      <w:proofErr w:type="spellStart"/>
+        <w:t xml:space="preserve"> </w:t>
+      </w:r>
+      <w:r>
+        <w:t>[</w:t>
+      </w:r>
       <w:r>
         <w:t>lastcleared</w:t>
       </w:r>
-      <w:proofErr w:type="spellEnd"/>
-      <w:r>
-        <w:t xml:space="preserve">&gt; </w:t>
-      </w:r>
-      <w:r>
-        <w:t xml:space="preserve">= </w:t>
-      </w:r>
-      <w:proofErr w:type="spellStart"/>
-      <w:r>
-        <w:t>currentsemester</w:t>
-      </w:r>
-      <w:proofErr w:type="spellEnd"/>
-      <w:r>
-        <w:t xml:space="preserve"> then proceed else indicate that financial clearance analysis is reserved for current enrollees only and return to search textbox </w:t>
+      <w:r>
+        <w:t>]</w:t>
+      </w:r>
+      <w:r>
+        <w:t xml:space="preserve"> </w:t>
+      </w:r>
+      <w:r>
+        <w:t xml:space="preserve">= currentsemester then proceed else indicate that financial clearance analysis is reserved for current enrollees only and return to search textbox </w:t>
       </w:r>
     </w:p>
     <w:p>
@@ -2636,12 +2156,76 @@
     </w:p>
     <w:p>
       <w:pPr>
-        <w:pStyle w:val="ListParagraph"/>
-        <w:numPr>
-          <w:ilvl w:val="2"/>
-          <w:numId w:val="3"/>
-        </w:numPr>
-      </w:pPr>
+        <w:ind w:left="2880"/>
+      </w:pPr>
+      <w:r>
+        <w:t xml:space="preserve">1.5.1 </w:t>
+      </w:r>
+      <w:r>
+        <w:t>EXEC dbo.Sp_GetFCWorksheetItems</w:t>
+      </w:r>
+    </w:p>
+    <w:p>
+      <w:pPr>
+        <w:ind w:left="2880"/>
+      </w:pPr>
+      <w:r>
+        <w:tab/>
+        <w:t xml:space="preserve">    @ID_NUM = &lt;idnumber&gt;,</w:t>
+      </w:r>
+    </w:p>
+    <w:p>
+      <w:pPr>
+        <w:ind w:left="2880"/>
+      </w:pPr>
+      <w:r>
+        <w:tab/>
+        <w:t xml:space="preserve">    @DropClassesDate = 'YYYY-MM-DD';</w:t>
+      </w:r>
+    </w:p>
+    <w:p>
+      <w:pPr>
+        <w:ind w:left="2880"/>
+      </w:pPr>
+      <w:r>
+        <w:t xml:space="preserve">1.5.2 Calculate the net amount of the TRANS_AMT in the recordset </w:t>
+      </w:r>
+    </w:p>
+    <w:p>
+      <w:pPr>
+        <w:ind w:left="2880"/>
+      </w:pPr>
+      <w:r>
+        <w:t>1.5.3 Total monies due: tblstudent.accountbalance + net amount</w:t>
+      </w:r>
+    </w:p>
+    <w:p>
+      <w:pPr>
+        <w:ind w:left="2880"/>
+      </w:pPr>
+      <w:r>
+        <w:t>1.5.4 80% required to clear financially</w:t>
+      </w:r>
+    </w:p>
+    <w:p>
+      <w:pPr>
+        <w:ind w:left="2880"/>
+      </w:pPr>
+      <w:r>
+        <w:t xml:space="preserve">1.5.5 if netamount &lt; 0  then exit else ‘Amount needed to clear’ =  (tblStudent.accountbalance + </w:t>
+      </w:r>
+      <w:r>
+        <w:t>(</w:t>
+      </w:r>
+      <w:r>
+        <w:t>netamount</w:t>
+      </w:r>
+      <w:r>
+        <w:t xml:space="preserve"> * .80</w:t>
+      </w:r>
+      <w:r>
+        <w:t>)</w:t>
+      </w:r>
     </w:p>
     <w:sectPr>
       <w:pgSz w:w="12240" w:h="15840"/>
@@ -3564,6 +3148,7 @@
   <w:style w:type="character" w:default="1" w:styleId="DefaultParagraphFont">
     <w:name w:val="Default Paragraph Font"/>
     <w:uiPriority w:val="1"/>
+    <w:semiHidden/>
     <w:unhideWhenUsed/>
   </w:style>
   <w:style w:type="table" w:default="1" w:styleId="TableNormal">
@@ -3875,6 +3460,58 @@
       <w:smallCaps/>
       <w:color w:val="0F4761" w:themeColor="accent1" w:themeShade="BF"/>
       <w:spacing w:val="5"/>
+    </w:rPr>
+  </w:style>
+  <w:style w:type="paragraph" w:styleId="HTMLPreformatted">
+    <w:name w:val="HTML Preformatted"/>
+    <w:basedOn w:val="Normal"/>
+    <w:link w:val="HTMLPreformattedChar"/>
+    <w:uiPriority w:val="99"/>
+    <w:semiHidden/>
+    <w:unhideWhenUsed/>
+    <w:rsid w:val="003E3762"/>
+    <w:pPr>
+      <w:tabs>
+        <w:tab w:val="left" w:pos="916"/>
+        <w:tab w:val="left" w:pos="1832"/>
+        <w:tab w:val="left" w:pos="2748"/>
+        <w:tab w:val="left" w:pos="3664"/>
+        <w:tab w:val="left" w:pos="4580"/>
+        <w:tab w:val="left" w:pos="5496"/>
+        <w:tab w:val="left" w:pos="6412"/>
+        <w:tab w:val="left" w:pos="7328"/>
+        <w:tab w:val="left" w:pos="8244"/>
+        <w:tab w:val="left" w:pos="9160"/>
+        <w:tab w:val="left" w:pos="10076"/>
+        <w:tab w:val="left" w:pos="10992"/>
+        <w:tab w:val="left" w:pos="11908"/>
+        <w:tab w:val="left" w:pos="12824"/>
+        <w:tab w:val="left" w:pos="13740"/>
+        <w:tab w:val="left" w:pos="14656"/>
+      </w:tabs>
+      <w:spacing w:after="0" w:line="240" w:lineRule="auto"/>
+    </w:pPr>
+    <w:rPr>
+      <w:rFonts w:ascii="Courier New" w:eastAsia="Times New Roman" w:hAnsi="Courier New" w:cs="Courier New"/>
+      <w:kern w:val="0"/>
+      <w:sz w:val="20"/>
+      <w:szCs w:val="20"/>
+      <w14:ligatures w14:val="none"/>
+    </w:rPr>
+  </w:style>
+  <w:style w:type="character" w:customStyle="1" w:styleId="HTMLPreformattedChar">
+    <w:name w:val="HTML Preformatted Char"/>
+    <w:basedOn w:val="DefaultParagraphFont"/>
+    <w:link w:val="HTMLPreformatted"/>
+    <w:uiPriority w:val="99"/>
+    <w:semiHidden/>
+    <w:rsid w:val="003E3762"/>
+    <w:rPr>
+      <w:rFonts w:ascii="Courier New" w:eastAsia="Times New Roman" w:hAnsi="Courier New" w:cs="Courier New"/>
+      <w:kern w:val="0"/>
+      <w:sz w:val="20"/>
+      <w:szCs w:val="20"/>
+      <w14:ligatures w14:val="none"/>
     </w:rPr>
   </w:style>
 </w:styles>

</xml_diff>